<commit_message>
Fopa lab4: add task
</commit_message>
<xml_diff>
--- a/fopa/lab4/report.docx
+++ b/fopa/lab4/report.docx
@@ -7135,45 +7135,6 @@
     <w:p>
       <w:pPr>
         <w:jc w:val="both"/>
-      </w:pPr>
-    </w:p>
-    <w:p>
-      <w:pPr>
-        <w:jc w:val="both"/>
-      </w:pPr>
-    </w:p>
-    <w:p>
-      <w:pPr>
-        <w:jc w:val="both"/>
-      </w:pPr>
-    </w:p>
-    <w:p>
-      <w:pPr>
-        <w:jc w:val="both"/>
-        <w:rPr>
-          <w:lang w:val="en-US"/>
-        </w:rPr>
-      </w:pPr>
-    </w:p>
-    <w:p>
-      <w:pPr>
-        <w:jc w:val="both"/>
-        <w:rPr>
-          <w:lang w:val="en-US"/>
-        </w:rPr>
-      </w:pPr>
-    </w:p>
-    <w:p>
-      <w:pPr>
-        <w:jc w:val="both"/>
-        <w:rPr>
-          <w:lang w:val="en-US"/>
-        </w:rPr>
-      </w:pPr>
-    </w:p>
-    <w:p>
-      <w:pPr>
-        <w:jc w:val="both"/>
         <w:rPr>
           <w:lang w:val="en-US"/>
         </w:rPr>
@@ -7194,6 +7155,7 @@
       </w:pPr>
       <w:bookmarkStart w:id="3" w:name="_Toc223461381"/>
       <w:r>
+        <w:lastRenderedPageBreak/>
         <w:t>Описание программы</w:t>
       </w:r>
       <w:bookmarkEnd w:id="3"/>
@@ -7850,7 +7812,6 @@
         <w:rPr>
           <w:lang w:val="en-US"/>
         </w:rPr>
-        <w:lastRenderedPageBreak/>
         <w:t xml:space="preserve">11D - </w:t>
       </w:r>
       <w:r>
@@ -7904,100 +7865,6 @@
     <w:p>
       <w:pPr>
         <w:jc w:val="both"/>
-      </w:pPr>
-    </w:p>
-    <w:p>
-      <w:pPr>
-        <w:jc w:val="both"/>
-      </w:pPr>
-    </w:p>
-    <w:p>
-      <w:pPr>
-        <w:jc w:val="both"/>
-      </w:pPr>
-    </w:p>
-    <w:p>
-      <w:pPr>
-        <w:jc w:val="both"/>
-      </w:pPr>
-    </w:p>
-    <w:p>
-      <w:pPr>
-        <w:jc w:val="both"/>
-      </w:pPr>
-    </w:p>
-    <w:p>
-      <w:pPr>
-        <w:jc w:val="both"/>
-      </w:pPr>
-    </w:p>
-    <w:p>
-      <w:pPr>
-        <w:jc w:val="both"/>
-      </w:pPr>
-    </w:p>
-    <w:p>
-      <w:pPr>
-        <w:jc w:val="both"/>
-      </w:pPr>
-    </w:p>
-    <w:p>
-      <w:pPr>
-        <w:jc w:val="both"/>
-      </w:pPr>
-    </w:p>
-    <w:p>
-      <w:pPr>
-        <w:jc w:val="both"/>
-      </w:pPr>
-    </w:p>
-    <w:p>
-      <w:pPr>
-        <w:jc w:val="both"/>
-      </w:pPr>
-    </w:p>
-    <w:p>
-      <w:pPr>
-        <w:jc w:val="both"/>
-      </w:pPr>
-    </w:p>
-    <w:p>
-      <w:pPr>
-        <w:jc w:val="both"/>
-      </w:pPr>
-    </w:p>
-    <w:p>
-      <w:pPr>
-        <w:jc w:val="both"/>
-      </w:pPr>
-    </w:p>
-    <w:p/>
-    <w:p>
-      <w:pPr>
-        <w:rPr>
-          <w:lang w:val="en-US"/>
-        </w:rPr>
-      </w:pPr>
-    </w:p>
-    <w:p>
-      <w:pPr>
-        <w:rPr>
-          <w:lang w:val="en-US"/>
-        </w:rPr>
-      </w:pPr>
-    </w:p>
-    <w:p>
-      <w:pPr>
-        <w:rPr>
-          <w:lang w:val="en-US"/>
-        </w:rPr>
-      </w:pPr>
-    </w:p>
-    <w:p>
-      <w:pPr>
-        <w:rPr>
-          <w:lang w:val="en-US"/>
-        </w:rPr>
       </w:pPr>
     </w:p>
     <w:p>
@@ -27013,85 +26880,126 @@
     </w:p>
     <w:p>
       <w:pPr>
+        <w:pStyle w:val="Heading2"/>
+        <w:jc w:val="center"/>
+        <w:rPr>
+          <w:b/>
+          <w:bCs/>
+          <w:lang w:val="en-US"/>
+        </w:rPr>
+      </w:pPr>
+      <w:r>
+        <w:rPr>
+          <w:b/>
+          <w:bCs/>
+        </w:rPr>
+        <w:lastRenderedPageBreak/>
+        <w:t>Дополнительное задание</w:t>
+      </w:r>
+    </w:p>
+    <w:p>
+      <w:r>
+        <w:t xml:space="preserve">Исходный код доступен на </w:t>
+      </w:r>
+      <w:r>
         <w:rPr>
           <w:lang w:val="en-US"/>
         </w:rPr>
+        <w:t>GitHub</w:t>
+      </w:r>
+      <w:r>
+        <w:t>:</w:t>
+      </w:r>
+    </w:p>
+    <w:p>
+      <w:hyperlink r:id="rId9" w:history="1">
+        <w:r>
+          <w:rPr>
+            <w:rStyle w:val="Hyperlink"/>
+          </w:rPr>
+          <w:t>https://github.com/Miwm64/itmo_cse/blob/</w:t>
+        </w:r>
+        <w:r>
+          <w:rPr>
+            <w:rStyle w:val="Hyperlink"/>
+            <w:lang w:val="en-US"/>
+          </w:rPr>
+          <w:t>master</w:t>
+        </w:r>
+        <w:r>
+          <w:rPr>
+            <w:rStyle w:val="Hyperlink"/>
+          </w:rPr>
+          <w:t>/</w:t>
+        </w:r>
+        <w:proofErr w:type="spellStart"/>
+        <w:r>
+          <w:rPr>
+            <w:rStyle w:val="Hyperlink"/>
+          </w:rPr>
+          <w:t>fopa</w:t>
+        </w:r>
+        <w:proofErr w:type="spellEnd"/>
+        <w:r>
+          <w:rPr>
+            <w:rStyle w:val="Hyperlink"/>
+          </w:rPr>
+          <w:t>/lab4/</w:t>
+        </w:r>
+        <w:proofErr w:type="spellStart"/>
+        <w:r>
+          <w:rPr>
+            <w:rStyle w:val="Hyperlink"/>
+          </w:rPr>
+          <w:t>add</w:t>
+        </w:r>
+        <w:proofErr w:type="spellEnd"/>
+        <w:r>
+          <w:rPr>
+            <w:rStyle w:val="Hyperlink"/>
+          </w:rPr>
+          <w:t>.</w:t>
+        </w:r>
+        <w:proofErr w:type="spellStart"/>
+        <w:r>
+          <w:rPr>
+            <w:rStyle w:val="Hyperlink"/>
+            <w:lang w:val="en-US"/>
+          </w:rPr>
+          <w:t>asm</w:t>
+        </w:r>
+        <w:proofErr w:type="spellEnd"/>
+      </w:hyperlink>
+    </w:p>
+    <w:p/>
+    <w:p/>
+    <w:p/>
+    <w:p/>
+    <w:p/>
+    <w:p/>
+    <w:p/>
+    <w:p/>
+    <w:p/>
+    <w:p/>
+    <w:p/>
+    <w:p>
+      <w:pPr>
+        <w:pStyle w:val="Heading1"/>
+        <w:jc w:val="center"/>
+        <w:rPr>
+          <w:b/>
+          <w:bCs/>
+        </w:rPr>
       </w:pPr>
+      <w:bookmarkStart w:id="4" w:name="_Toc223461383"/>
     </w:p>
     <w:p>
       <w:pPr>
+        <w:pStyle w:val="Heading1"/>
+        <w:jc w:val="center"/>
         <w:rPr>
-          <w:lang w:val="en-US"/>
-        </w:rPr>
-      </w:pPr>
-    </w:p>
-    <w:p>
-      <w:pPr>
-        <w:rPr>
-          <w:lang w:val="en-US"/>
-        </w:rPr>
-      </w:pPr>
-    </w:p>
-    <w:p>
-      <w:pPr>
-        <w:rPr>
-          <w:lang w:val="en-US"/>
-        </w:rPr>
-      </w:pPr>
-    </w:p>
-    <w:p>
-      <w:pPr>
-        <w:rPr>
-          <w:lang w:val="en-US"/>
-        </w:rPr>
-      </w:pPr>
-    </w:p>
-    <w:p>
-      <w:pPr>
-        <w:rPr>
-          <w:lang w:val="en-US"/>
-        </w:rPr>
-      </w:pPr>
-    </w:p>
-    <w:p>
-      <w:pPr>
-        <w:rPr>
-          <w:lang w:val="en-US"/>
-        </w:rPr>
-      </w:pPr>
-    </w:p>
-    <w:p>
-      <w:pPr>
-        <w:rPr>
-          <w:lang w:val="en-US"/>
-        </w:rPr>
-      </w:pPr>
-    </w:p>
-    <w:p>
-      <w:pPr>
-        <w:rPr>
-          <w:lang w:val="en-US"/>
-        </w:rPr>
-      </w:pPr>
-    </w:p>
-    <w:p>
-      <w:pPr>
-        <w:rPr>
-          <w:lang w:val="en-US"/>
-        </w:rPr>
-      </w:pPr>
-    </w:p>
-    <w:p>
-      <w:pPr>
-        <w:rPr>
-          <w:lang w:val="en-US"/>
-        </w:rPr>
-      </w:pPr>
-    </w:p>
-    <w:p>
-      <w:pPr>
-        <w:rPr>
-          <w:lang w:val="en-US"/>
+          <w:b/>
+          <w:bCs/>
         </w:rPr>
       </w:pPr>
     </w:p>
@@ -27104,12 +27012,33 @@
           <w:bCs/>
         </w:rPr>
       </w:pPr>
-      <w:bookmarkStart w:id="4" w:name="_Toc223461383"/>
+    </w:p>
+    <w:p>
+      <w:pPr>
+        <w:pStyle w:val="Heading1"/>
+        <w:rPr>
+          <w:b/>
+          <w:bCs/>
+        </w:rPr>
+      </w:pPr>
+    </w:p>
+    <w:p/>
+    <w:p/>
+    <w:p>
+      <w:pPr>
+        <w:pStyle w:val="Heading1"/>
+        <w:jc w:val="center"/>
+        <w:rPr>
+          <w:b/>
+          <w:bCs/>
+        </w:rPr>
+      </w:pPr>
       <w:r>
         <w:rPr>
           <w:b/>
           <w:bCs/>
         </w:rPr>
+        <w:lastRenderedPageBreak/>
         <w:t>Заключение</w:t>
       </w:r>
       <w:bookmarkEnd w:id="4"/>
@@ -27181,6 +27110,7 @@
           <w:b/>
           <w:bCs/>
         </w:rPr>
+        <w:lastRenderedPageBreak/>
         <w:t xml:space="preserve">Список </w:t>
       </w:r>
       <w:r>
@@ -27222,7 +27152,7 @@
         </w:rPr>
         <w:t xml:space="preserve">Методические указания к лабораторным работам по курсу «Основы профессиональной деятельности» / В. В. Кириллов, А. А. Приблуда, С. В. Клименков, Д. Б. Афанасьев. — Санкт-Петербург, 2019. — Версия 1.41. — Электронный ресурс. — Режим доступа: </w:t>
       </w:r>
-      <w:hyperlink r:id="rId9" w:history="1">
+      <w:hyperlink r:id="rId10" w:history="1">
         <w:r>
           <w:rPr>
             <w:rStyle w:val="Hyperlink"/>
@@ -27260,7 +27190,6 @@
         <w:rPr>
           <w:lang w:val="en-RU"/>
         </w:rPr>
-        <w:lastRenderedPageBreak/>
         <w:t>Клименков С. В.</w:t>
       </w:r>
     </w:p>
@@ -27285,7 +27214,7 @@
         </w:rPr>
         <w:t xml:space="preserve">. Презентация. — 2018–2019 уч. год. — v. 1.45.09 от 31.05.2022. — Электронный ресурс. — 98 с. — Режим доступа: </w:t>
       </w:r>
-      <w:hyperlink r:id="rId10" w:history="1">
+      <w:hyperlink r:id="rId11" w:history="1">
         <w:r>
           <w:rPr>
             <w:rStyle w:val="Hyperlink"/>
@@ -27333,7 +27262,7 @@
     </w:p>
     <w:p/>
     <w:sectPr>
-      <w:footerReference w:type="default" r:id="rId11"/>
+      <w:footerReference w:type="default" r:id="rId12"/>
       <w:pgSz w:w="11906" w:h="16838" w:code="9"/>
       <w:pgMar w:top="1134" w:right="851" w:bottom="1134" w:left="1701" w:header="709" w:footer="709" w:gutter="0"/>
       <w:cols w:space="708"/>

</xml_diff>